<commit_message>
chore: bump version to 1.1.6
</commit_message>
<xml_diff>
--- a/TomTatBenhAn_WPF/Templates/TemplateTomTat1.docx
+++ b/TomTatBenhAn_WPF/Templates/TemplateTomTat1.docx
@@ -604,9 +604,8 @@
           <w:sz w:val="32"/>
           <w:szCs w:val="30"/>
         </w:rPr>
-        <w:t xml:space="preserve">BẢN </w:t>
-      </w:r>
-      <w:proofErr w:type="gramStart"/>
+        <w:t>BẢN TÓM  TẮT  HỒ</w:t>
+      </w:r>
       <w:r>
         <w:rPr>
           <w:rFonts w:cs="Times New Roman"/>
@@ -615,9 +614,8 @@
           <w:sz w:val="32"/>
           <w:szCs w:val="30"/>
         </w:rPr>
-        <w:t>TÓM  TẮT</w:t>
-      </w:r>
-      <w:proofErr w:type="gramEnd"/>
+        <w:t xml:space="preserve">  SƠ </w:t>
+      </w:r>
       <w:r>
         <w:rPr>
           <w:rFonts w:cs="Times New Roman"/>
@@ -626,9 +624,8 @@
           <w:sz w:val="32"/>
           <w:szCs w:val="30"/>
         </w:rPr>
-        <w:t xml:space="preserve">  </w:t>
-      </w:r>
-      <w:proofErr w:type="gramStart"/>
+        <w:t xml:space="preserve"> BỆ</w:t>
+      </w:r>
       <w:r>
         <w:rPr>
           <w:rFonts w:cs="Times New Roman"/>
@@ -637,7 +634,7 @@
           <w:sz w:val="32"/>
           <w:szCs w:val="30"/>
         </w:rPr>
-        <w:t>HỒ</w:t>
+        <w:t xml:space="preserve">NH  </w:t>
       </w:r>
       <w:r>
         <w:rPr>
@@ -647,61 +644,8 @@
           <w:sz w:val="32"/>
           <w:szCs w:val="30"/>
         </w:rPr>
-        <w:t xml:space="preserve">  SƠ</w:t>
-      </w:r>
-      <w:proofErr w:type="gramEnd"/>
-      <w:r>
-        <w:rPr>
-          <w:rFonts w:cs="Times New Roman"/>
-          <w:b/>
-          <w:color w:val="000000"/>
-          <w:sz w:val="32"/>
-          <w:szCs w:val="30"/>
-        </w:rPr>
-        <w:t xml:space="preserve"> </w:t>
-      </w:r>
-      <w:r>
-        <w:rPr>
-          <w:rFonts w:cs="Times New Roman"/>
-          <w:b/>
-          <w:color w:val="000000"/>
-          <w:sz w:val="32"/>
-          <w:szCs w:val="30"/>
-        </w:rPr>
-        <w:t xml:space="preserve"> </w:t>
-      </w:r>
-      <w:proofErr w:type="gramStart"/>
-      <w:r>
-        <w:rPr>
-          <w:rFonts w:cs="Times New Roman"/>
-          <w:b/>
-          <w:color w:val="000000"/>
-          <w:sz w:val="32"/>
-          <w:szCs w:val="30"/>
-        </w:rPr>
-        <w:t>BỆ</w:t>
-      </w:r>
-      <w:r>
-        <w:rPr>
-          <w:rFonts w:cs="Times New Roman"/>
-          <w:b/>
-          <w:color w:val="000000"/>
-          <w:sz w:val="32"/>
-          <w:szCs w:val="30"/>
-        </w:rPr>
-        <w:t xml:space="preserve">NH  </w:t>
-      </w:r>
-      <w:r>
-        <w:rPr>
-          <w:rFonts w:cs="Times New Roman"/>
-          <w:b/>
-          <w:color w:val="000000"/>
-          <w:sz w:val="32"/>
-          <w:szCs w:val="30"/>
-        </w:rPr>
         <w:t>ÁN</w:t>
       </w:r>
-      <w:proofErr w:type="gramEnd"/>
     </w:p>
     <w:p>
       <w:pPr>
@@ -2388,77 +2332,6 @@
         </w:rPr>
         <w:t>.</w:t>
       </w:r>
-      <w:r>
-        <w:rPr>
-          <w:rFonts w:cs="Times New Roman"/>
-          <w:bCs/>
-          <w:color w:val="000000"/>
-          <w:sz w:val="28"/>
-          <w:szCs w:val="28"/>
-          <w:lang w:val="fr-FR"/>
-        </w:rPr>
-        <w:tab/>
-      </w:r>
-      <w:r>
-        <w:rPr>
-          <w:rFonts w:cs="Times New Roman"/>
-          <w:bCs/>
-          <w:color w:val="000000"/>
-          <w:sz w:val="28"/>
-          <w:szCs w:val="28"/>
-          <w:lang w:val="fr-FR"/>
-        </w:rPr>
-        <w:tab/>
-      </w:r>
-      <w:r>
-        <w:rPr>
-          <w:rFonts w:cs="Times New Roman"/>
-          <w:bCs/>
-          <w:color w:val="000000"/>
-          <w:sz w:val="28"/>
-          <w:szCs w:val="28"/>
-          <w:lang w:val="fr-FR"/>
-        </w:rPr>
-        <w:tab/>
-      </w:r>
-      <w:r>
-        <w:rPr>
-          <w:rFonts w:cs="Times New Roman"/>
-          <w:bCs/>
-          <w:color w:val="000000"/>
-          <w:sz w:val="28"/>
-          <w:szCs w:val="28"/>
-          <w:lang w:val="fr-FR"/>
-        </w:rPr>
-        <w:tab/>
-      </w:r>
-      <w:r>
-        <w:rPr>
-          <w:rFonts w:cs="Times New Roman"/>
-          <w:bCs/>
-          <w:color w:val="000000"/>
-          <w:sz w:val="28"/>
-          <w:szCs w:val="28"/>
-          <w:lang w:val="fr-FR"/>
-        </w:rPr>
-        <w:tab/>
-      </w:r>
-    </w:p>
-    <w:p>
-      <w:pPr>
-        <w:widowControl w:val="0"/>
-        <w:autoSpaceDE w:val="0"/>
-        <w:autoSpaceDN w:val="0"/>
-        <w:adjustRightInd w:val="0"/>
-        <w:spacing w:after="0" w:line="264" w:lineRule="auto"/>
-        <w:jc w:val="both"/>
-        <w:rPr>
-          <w:rFonts w:cs="Times New Roman"/>
-          <w:color w:val="000000"/>
-          <w:sz w:val="28"/>
-          <w:szCs w:val="28"/>
-        </w:rPr>
-      </w:pPr>
       <w:proofErr w:type="spellStart"/>
       <w:r>
         <w:rPr>
@@ -2597,6 +2470,28 @@
         </w:rPr>
         <w:tab/>
       </w:r>
+      <w:proofErr w:type="spellStart"/>
+      <w:r>
+        <w:rPr>
+          <w:rFonts w:cs="Times New Roman"/>
+          <w:b/>
+          <w:color w:val="000000"/>
+          <w:sz w:val="28"/>
+          <w:szCs w:val="28"/>
+        </w:rPr>
+        <w:t>Mã</w:t>
+      </w:r>
+      <w:proofErr w:type="spellEnd"/>
+      <w:r>
+        <w:rPr>
+          <w:rFonts w:cs="Times New Roman"/>
+          <w:b/>
+          <w:color w:val="000000"/>
+          <w:sz w:val="28"/>
+          <w:szCs w:val="28"/>
+        </w:rPr>
+        <w:t xml:space="preserve"> ICD:</w:t>
+      </w:r>
       <w:r>
         <w:rPr>
           <w:rFonts w:cs="Times New Roman"/>
@@ -2605,8 +2500,10 @@
           <w:sz w:val="28"/>
           <w:szCs w:val="28"/>
         </w:rPr>
-        <w:tab/>
-      </w:r>
+        <w:t xml:space="preserve"> </w:t>
+      </w:r>
+      <w:bookmarkStart w:id="16" w:name="CD_MaICDPhuVaoVien"/>
+      <w:bookmarkEnd w:id="16"/>
       <w:r>
         <w:rPr>
           <w:rFonts w:cs="Times New Roman"/>
@@ -2615,27 +2512,7 @@
           <w:sz w:val="28"/>
           <w:szCs w:val="28"/>
         </w:rPr>
-        <w:tab/>
-      </w:r>
-      <w:r>
-        <w:rPr>
-          <w:rFonts w:cs="Times New Roman"/>
-          <w:bCs/>
-          <w:color w:val="000000"/>
-          <w:sz w:val="28"/>
-          <w:szCs w:val="28"/>
-        </w:rPr>
-        <w:tab/>
-      </w:r>
-      <w:r>
-        <w:rPr>
-          <w:rFonts w:cs="Times New Roman"/>
-          <w:bCs/>
-          <w:color w:val="000000"/>
-          <w:sz w:val="28"/>
-          <w:szCs w:val="28"/>
-        </w:rPr>
-        <w:tab/>
+        <w:t xml:space="preserve"> </w:t>
       </w:r>
     </w:p>
     <w:p>
@@ -2654,49 +2531,103 @@
           <w:szCs w:val="28"/>
         </w:rPr>
       </w:pPr>
-      <w:proofErr w:type="spellStart"/>
-      <w:r>
-        <w:rPr>
-          <w:rFonts w:cs="Times New Roman"/>
-          <w:b/>
-          <w:color w:val="000000"/>
-          <w:sz w:val="28"/>
-          <w:szCs w:val="28"/>
-        </w:rPr>
-        <w:t>Mã</w:t>
-      </w:r>
-      <w:proofErr w:type="spellEnd"/>
-      <w:r>
-        <w:rPr>
-          <w:rFonts w:cs="Times New Roman"/>
-          <w:b/>
-          <w:color w:val="000000"/>
-          <w:sz w:val="28"/>
-          <w:szCs w:val="28"/>
-        </w:rPr>
-        <w:t xml:space="preserve"> ICD:</w:t>
-      </w:r>
-      <w:r>
-        <w:rPr>
-          <w:rFonts w:cs="Times New Roman"/>
-          <w:bCs/>
-          <w:color w:val="000000"/>
-          <w:sz w:val="28"/>
-          <w:szCs w:val="28"/>
-        </w:rPr>
-        <w:t xml:space="preserve"> </w:t>
-      </w:r>
-      <w:bookmarkStart w:id="16" w:name="CD_MaICDPhuVaoVien"/>
-      <w:bookmarkEnd w:id="16"/>
-      <w:r>
-        <w:rPr>
-          <w:rFonts w:cs="Times New Roman"/>
-          <w:bCs/>
-          <w:color w:val="000000"/>
-          <w:sz w:val="28"/>
-          <w:szCs w:val="28"/>
-        </w:rPr>
-        <w:t xml:space="preserve"> </w:t>
+      <w:r>
+        <w:rPr>
+          <w:rFonts w:cs="Times New Roman"/>
+          <w:b/>
+          <w:color w:val="000000"/>
+          <w:sz w:val="28"/>
+          <w:szCs w:val="28"/>
+        </w:rPr>
+        <w:t xml:space="preserve">2. </w:t>
+      </w:r>
+      <w:proofErr w:type="spellStart"/>
+      <w:r>
+        <w:rPr>
+          <w:rFonts w:cs="Times New Roman"/>
+          <w:b/>
+          <w:color w:val="000000"/>
+          <w:sz w:val="28"/>
+          <w:szCs w:val="28"/>
+        </w:rPr>
+        <w:t>Chẩn</w:t>
+      </w:r>
+      <w:proofErr w:type="spellEnd"/>
+      <w:r>
+        <w:rPr>
+          <w:rFonts w:cs="Times New Roman"/>
+          <w:b/>
+          <w:color w:val="000000"/>
+          <w:sz w:val="28"/>
+          <w:szCs w:val="28"/>
+        </w:rPr>
+        <w:t xml:space="preserve"> </w:t>
+      </w:r>
+      <w:proofErr w:type="spellStart"/>
+      <w:r>
+        <w:rPr>
+          <w:rFonts w:cs="Times New Roman"/>
+          <w:b/>
+          <w:color w:val="000000"/>
+          <w:sz w:val="28"/>
+          <w:szCs w:val="28"/>
+        </w:rPr>
+        <w:t>đoán</w:t>
+      </w:r>
+      <w:proofErr w:type="spellEnd"/>
+      <w:r>
+        <w:rPr>
+          <w:rFonts w:cs="Times New Roman"/>
+          <w:b/>
+          <w:color w:val="000000"/>
+          <w:sz w:val="28"/>
+          <w:szCs w:val="28"/>
+        </w:rPr>
+        <w:t xml:space="preserve"> </w:t>
+      </w:r>
+      <w:proofErr w:type="spellStart"/>
+      <w:r>
+        <w:rPr>
+          <w:rFonts w:cs="Times New Roman"/>
+          <w:b/>
+          <w:color w:val="000000"/>
+          <w:sz w:val="28"/>
+          <w:szCs w:val="28"/>
+        </w:rPr>
+        <w:t>ra</w:t>
+      </w:r>
+      <w:proofErr w:type="spellEnd"/>
+      <w:r>
+        <w:rPr>
+          <w:rFonts w:cs="Times New Roman"/>
+          <w:b/>
+          <w:color w:val="000000"/>
+          <w:sz w:val="28"/>
+          <w:szCs w:val="28"/>
+        </w:rPr>
+        <w:t xml:space="preserve"> </w:t>
+      </w:r>
+      <w:proofErr w:type="spellStart"/>
+      <w:r>
+        <w:rPr>
+          <w:rFonts w:cs="Times New Roman"/>
+          <w:b/>
+          <w:color w:val="000000"/>
+          <w:sz w:val="28"/>
+          <w:szCs w:val="28"/>
+        </w:rPr>
+        <w:t>viện</w:t>
+      </w:r>
+      <w:proofErr w:type="spellEnd"/>
+      <w:r>
+        <w:rPr>
+          <w:rFonts w:cs="Times New Roman"/>
+          <w:b/>
+          <w:color w:val="000000"/>
+          <w:sz w:val="28"/>
+          <w:szCs w:val="28"/>
+        </w:rPr>
+        <w:t>:</w:t>
       </w:r>
     </w:p>
     <w:p>
@@ -2715,121 +2646,6 @@
           <w:szCs w:val="28"/>
         </w:rPr>
       </w:pPr>
-      <w:r>
-        <w:rPr>
-          <w:rFonts w:cs="Times New Roman"/>
-          <w:b/>
-          <w:color w:val="000000"/>
-          <w:sz w:val="28"/>
-          <w:szCs w:val="28"/>
-        </w:rPr>
-        <w:t xml:space="preserve">2. </w:t>
-      </w:r>
-      <w:proofErr w:type="spellStart"/>
-      <w:r>
-        <w:rPr>
-          <w:rFonts w:cs="Times New Roman"/>
-          <w:b/>
-          <w:color w:val="000000"/>
-          <w:sz w:val="28"/>
-          <w:szCs w:val="28"/>
-        </w:rPr>
-        <w:t>Chẩn</w:t>
-      </w:r>
-      <w:proofErr w:type="spellEnd"/>
-      <w:r>
-        <w:rPr>
-          <w:rFonts w:cs="Times New Roman"/>
-          <w:b/>
-          <w:color w:val="000000"/>
-          <w:sz w:val="28"/>
-          <w:szCs w:val="28"/>
-        </w:rPr>
-        <w:t xml:space="preserve"> </w:t>
-      </w:r>
-      <w:proofErr w:type="spellStart"/>
-      <w:r>
-        <w:rPr>
-          <w:rFonts w:cs="Times New Roman"/>
-          <w:b/>
-          <w:color w:val="000000"/>
-          <w:sz w:val="28"/>
-          <w:szCs w:val="28"/>
-        </w:rPr>
-        <w:t>đoán</w:t>
-      </w:r>
-      <w:proofErr w:type="spellEnd"/>
-      <w:r>
-        <w:rPr>
-          <w:rFonts w:cs="Times New Roman"/>
-          <w:b/>
-          <w:color w:val="000000"/>
-          <w:sz w:val="28"/>
-          <w:szCs w:val="28"/>
-        </w:rPr>
-        <w:t xml:space="preserve"> </w:t>
-      </w:r>
-      <w:proofErr w:type="spellStart"/>
-      <w:r>
-        <w:rPr>
-          <w:rFonts w:cs="Times New Roman"/>
-          <w:b/>
-          <w:color w:val="000000"/>
-          <w:sz w:val="28"/>
-          <w:szCs w:val="28"/>
-        </w:rPr>
-        <w:t>ra</w:t>
-      </w:r>
-      <w:proofErr w:type="spellEnd"/>
-      <w:r>
-        <w:rPr>
-          <w:rFonts w:cs="Times New Roman"/>
-          <w:b/>
-          <w:color w:val="000000"/>
-          <w:sz w:val="28"/>
-          <w:szCs w:val="28"/>
-        </w:rPr>
-        <w:t xml:space="preserve"> </w:t>
-      </w:r>
-      <w:proofErr w:type="spellStart"/>
-      <w:r>
-        <w:rPr>
-          <w:rFonts w:cs="Times New Roman"/>
-          <w:b/>
-          <w:color w:val="000000"/>
-          <w:sz w:val="28"/>
-          <w:szCs w:val="28"/>
-        </w:rPr>
-        <w:t>viện</w:t>
-      </w:r>
-      <w:proofErr w:type="spellEnd"/>
-      <w:r>
-        <w:rPr>
-          <w:rFonts w:cs="Times New Roman"/>
-          <w:b/>
-          <w:color w:val="000000"/>
-          <w:sz w:val="28"/>
-          <w:szCs w:val="28"/>
-        </w:rPr>
-        <w:t>:</w:t>
-      </w:r>
-    </w:p>
-    <w:p>
-      <w:pPr>
-        <w:widowControl w:val="0"/>
-        <w:autoSpaceDE w:val="0"/>
-        <w:autoSpaceDN w:val="0"/>
-        <w:adjustRightInd w:val="0"/>
-        <w:spacing w:after="0" w:line="264" w:lineRule="auto"/>
-        <w:jc w:val="both"/>
-        <w:rPr>
-          <w:rFonts w:cs="Times New Roman"/>
-          <w:bCs/>
-          <w:color w:val="000000"/>
-          <w:sz w:val="28"/>
-          <w:szCs w:val="28"/>
-        </w:rPr>
-      </w:pPr>
       <w:proofErr w:type="spellStart"/>
       <w:r>
         <w:rPr>
@@ -2896,73 +2712,6 @@
         </w:rPr>
         <w:t>.</w:t>
       </w:r>
-      <w:r>
-        <w:rPr>
-          <w:rFonts w:cs="Times New Roman"/>
-          <w:bCs/>
-          <w:color w:val="000000"/>
-          <w:sz w:val="28"/>
-          <w:szCs w:val="28"/>
-        </w:rPr>
-        <w:tab/>
-      </w:r>
-      <w:r>
-        <w:rPr>
-          <w:rFonts w:cs="Times New Roman"/>
-          <w:bCs/>
-          <w:color w:val="000000"/>
-          <w:sz w:val="28"/>
-          <w:szCs w:val="28"/>
-        </w:rPr>
-        <w:tab/>
-      </w:r>
-      <w:r>
-        <w:rPr>
-          <w:rFonts w:cs="Times New Roman"/>
-          <w:bCs/>
-          <w:color w:val="000000"/>
-          <w:sz w:val="28"/>
-          <w:szCs w:val="28"/>
-        </w:rPr>
-        <w:tab/>
-      </w:r>
-      <w:r>
-        <w:rPr>
-          <w:rFonts w:cs="Times New Roman"/>
-          <w:bCs/>
-          <w:color w:val="000000"/>
-          <w:sz w:val="28"/>
-          <w:szCs w:val="28"/>
-        </w:rPr>
-        <w:tab/>
-      </w:r>
-      <w:r>
-        <w:rPr>
-          <w:rFonts w:cs="Times New Roman"/>
-          <w:bCs/>
-          <w:color w:val="000000"/>
-          <w:sz w:val="28"/>
-          <w:szCs w:val="28"/>
-        </w:rPr>
-        <w:tab/>
-      </w:r>
-    </w:p>
-    <w:p>
-      <w:pPr>
-        <w:widowControl w:val="0"/>
-        <w:autoSpaceDE w:val="0"/>
-        <w:autoSpaceDN w:val="0"/>
-        <w:adjustRightInd w:val="0"/>
-        <w:spacing w:after="0" w:line="264" w:lineRule="auto"/>
-        <w:jc w:val="both"/>
-        <w:rPr>
-          <w:rFonts w:cs="Times New Roman"/>
-          <w:bCs/>
-          <w:color w:val="000000"/>
-          <w:sz w:val="28"/>
-          <w:szCs w:val="28"/>
-        </w:rPr>
-      </w:pPr>
       <w:proofErr w:type="spellStart"/>
       <w:r>
         <w:rPr>
@@ -3112,63 +2861,6 @@
         </w:rPr>
         <w:tab/>
       </w:r>
-      <w:r>
-        <w:rPr>
-          <w:rFonts w:cs="Times New Roman"/>
-          <w:bCs/>
-          <w:color w:val="000000"/>
-          <w:sz w:val="28"/>
-          <w:szCs w:val="28"/>
-        </w:rPr>
-        <w:tab/>
-      </w:r>
-      <w:r>
-        <w:rPr>
-          <w:rFonts w:cs="Times New Roman"/>
-          <w:bCs/>
-          <w:color w:val="000000"/>
-          <w:sz w:val="28"/>
-          <w:szCs w:val="28"/>
-        </w:rPr>
-        <w:tab/>
-      </w:r>
-      <w:r>
-        <w:rPr>
-          <w:rFonts w:cs="Times New Roman"/>
-          <w:bCs/>
-          <w:color w:val="000000"/>
-          <w:sz w:val="28"/>
-          <w:szCs w:val="28"/>
-        </w:rPr>
-        <w:tab/>
-      </w:r>
-      <w:r>
-        <w:rPr>
-          <w:rFonts w:cs="Times New Roman"/>
-          <w:bCs/>
-          <w:color w:val="000000"/>
-          <w:sz w:val="28"/>
-          <w:szCs w:val="28"/>
-        </w:rPr>
-        <w:tab/>
-      </w:r>
-    </w:p>
-    <w:p>
-      <w:pPr>
-        <w:widowControl w:val="0"/>
-        <w:autoSpaceDE w:val="0"/>
-        <w:autoSpaceDN w:val="0"/>
-        <w:adjustRightInd w:val="0"/>
-        <w:spacing w:after="0" w:line="264" w:lineRule="auto"/>
-        <w:jc w:val="both"/>
-        <w:rPr>
-          <w:rFonts w:cs="Times New Roman"/>
-          <w:bCs/>
-          <w:color w:val="000000"/>
-          <w:sz w:val="28"/>
-          <w:szCs w:val="28"/>
-        </w:rPr>
-      </w:pPr>
       <w:proofErr w:type="spellStart"/>
       <w:r>
         <w:rPr>
@@ -4799,24 +4491,6 @@
         </w:rPr>
         <w:t xml:space="preserve">: </w:t>
       </w:r>
-    </w:p>
-    <w:p>
-      <w:pPr>
-        <w:widowControl w:val="0"/>
-        <w:autoSpaceDE w:val="0"/>
-        <w:autoSpaceDN w:val="0"/>
-        <w:adjustRightInd w:val="0"/>
-        <w:spacing w:after="0" w:line="264" w:lineRule="auto"/>
-        <w:contextualSpacing/>
-        <w:jc w:val="both"/>
-        <w:rPr>
-          <w:rFonts w:cs="Times New Roman"/>
-          <w:b/>
-          <w:color w:val="000000"/>
-          <w:sz w:val="28"/>
-          <w:szCs w:val="28"/>
-        </w:rPr>
-      </w:pPr>
     </w:p>
     <w:tbl>
       <w:tblPr>
@@ -4871,7 +4545,6 @@
                 <w:sz w:val="28"/>
                 <w:szCs w:val="28"/>
               </w:rPr>
-              <w:lastRenderedPageBreak/>
               <w:t>Nội</w:t>
             </w:r>
             <w:proofErr w:type="spellEnd"/>
@@ -5597,6 +5270,7 @@
           <w:sz w:val="28"/>
           <w:szCs w:val="28"/>
         </w:rPr>
+        <w:lastRenderedPageBreak/>
         <w:t>d.Tình</w:t>
       </w:r>
       <w:proofErr w:type="spellEnd"/>

</xml_diff>